<commit_message>
Point report to the actual GitHub repository URL
</commit_message>
<xml_diff>
--- a/report/Case_Study_Mental_Health_in_Tech_Baqqali.docx
+++ b/report/Case_Study_Mental_Health_in_Tech_Baqqali.docx
@@ -99,7 +99,7 @@
         <w:rPr>
           <w:sz w:val="24"/>
         </w:rPr>
-        <w:t>Code repository: https://github.com/nbaqqali/mental-health-in-tech-case-study</w:t>
+        <w:t>Code repository: https://github.com/nbaqqali/mental-health-in-tech_case-study-</w:t>
       </w:r>
     </w:p>
     <w:p>
@@ -2017,7 +2017,7 @@
           <w:color w:val="0563C1"/>
           <w:u w:val="single"/>
         </w:rPr>
-        <w:t>https://github.com/nbaqqali/mental-health-in-tech-case-study</w:t>
+        <w:t>https://github.com/nbaqqali/mental-health-in-tech_case-study-</w:t>
       </w:r>
     </w:p>
     <w:p>

</xml_diff>